<commit_message>
Update Frontend hosting IP to 34.232.147.247 and regenerate Word doc
</commit_message>
<xml_diff>
--- a/AWS_Ubuntu_Frontend_Hosting_Guide.docx
+++ b/AWS_Ubuntu_Frontend_Hosting_Guide.docx
@@ -16,7 +16,7 @@
         </w:rPr>
         <w:t>មគ្គុទ្ទេសក៍ការដាក់ដំណើរការ FRONTEND លើ AWS UBUNTU SERVER</w:t>
         <w:br/>
-        <w:t>(React Vite SPA + Nginx Web Server on AWS EC2: 100.56.149.110)</w:t>
+        <w:t>(React Vite SPA + Nginx Web Server on AWS EC2: 34.232.147.247)</w:t>
       </w:r>
     </w:p>
     <w:p>
@@ -31,7 +31,7 @@
           <w:color w:val="006699"/>
           <w:sz w:val="19"/>
         </w:rPr>
-        <w:t>AWS Server IP: 100.56.149.110 | Port: 80 (HTTP) | React 18 + Vite + TailwindCSS</w:t>
+        <w:t>AWS Server IP: 34.232.147.247 | Port: 80 (HTTP) | React 18 + Vite + TailwindCSS</w:t>
       </w:r>
     </w:p>
     <w:p>
@@ -125,7 +125,7 @@
                 <w:rFonts w:ascii="Khmer OS Siemreap" w:hAnsi="Khmer OS Siemreap"/>
                 <w:sz w:val="19"/>
               </w:rPr>
-              <w:t>100.56.149.110</w:t>
+              <w:t>34.232.147.247</w:t>
             </w:r>
           </w:p>
         </w:tc>
@@ -329,7 +329,7 @@
                 <w:rFonts w:ascii="Khmer OS Siemreap" w:hAnsi="Khmer OS Siemreap"/>
                 <w:sz w:val="19"/>
               </w:rPr>
-              <w:t>Reverse Proxy /api/ -&gt; http://100.56.149.110:8080/api</w:t>
+              <w:t>Reverse Proxy /api/ -&gt; Backend Spring Boot API</w:t>
             </w:r>
           </w:p>
         </w:tc>
@@ -461,7 +461,7 @@
               </w:rPr>
               <w:t>chmod 400 "C:/path/to/your-key.pem"</w:t>
               <w:br/>
-              <w:t>ssh -i "C:/path/to/your-key.pem" ubuntu@100.56.149.110</w:t>
+              <w:t>ssh -i "C:/path/to/your-key.pem" ubuntu@34.232.147.247</w:t>
             </w:r>
           </w:p>
         </w:tc>
@@ -1140,7 +1140,7 @@
                 <w:color w:val="0066CC"/>
                 <w:sz w:val="18"/>
               </w:rPr>
-              <w:t>http://100.56.149.110</w:t>
+              <w:t>http://34.232.147.247</w:t>
             </w:r>
           </w:p>
         </w:tc>
@@ -1186,7 +1186,7 @@
                 <w:color w:val="0066CC"/>
                 <w:sz w:val="18"/>
               </w:rPr>
-              <w:t>http://100.56.149.110/login</w:t>
+              <w:t>http://34.232.147.247/login</w:t>
             </w:r>
           </w:p>
         </w:tc>
@@ -1232,7 +1232,7 @@
                 <w:color w:val="0066CC"/>
                 <w:sz w:val="18"/>
               </w:rPr>
-              <w:t>http://100.56.149.110/kiosk</w:t>
+              <w:t>http://34.232.147.247/kiosk</w:t>
             </w:r>
           </w:p>
         </w:tc>
@@ -1278,7 +1278,7 @@
                 <w:color w:val="0066CC"/>
                 <w:sz w:val="18"/>
               </w:rPr>
-              <w:t>http://100.56.149.110/employees</w:t>
+              <w:t>http://34.232.147.247/employees</w:t>
             </w:r>
           </w:p>
         </w:tc>
@@ -1297,7 +1297,7 @@
         </w:rPr>
         <w:t>― ចប់មគ្គុទ្ទេសក៍ការដាក់ដំណើរការ FRONTEND លើ AWS UBUNTU ―</w:t>
         <w:br/>
-        <w:t>Server IP: 100.56.149.110 | Port 80 (HTTP) | HR Chomnan System</w:t>
+        <w:t>Server IP: 34.232.147.247 | Port 80 (HTTP) | HR Chomnan System</w:t>
       </w:r>
     </w:p>
     <w:sectPr>

</xml_diff>